<commit_message>
manuscript(6.1b): fold verified bounded real-AACT learned-kernel win + conformal repair
Add 6.1b: on real ClinicalTrials.gov data (37 MAs/412 trials, LOR + oncology-HR families) the learned
kernel beats within-MA on the oncology-HR field (-0.0109[-0.0192,-0.0027], n=384); metadat headline
survives corpus expansion (corpus-only -0.0243); split-conformal repairs real-AACT coverage 0.672->0.903.
Bounded verified demonstration that field + conformal carry to real registry data. Rebuilt docx
(534KB, OOXML valid, 0 leaks).

Co-Authored-By: Claude Opus 4.8 (1M context) <noreply@anthropic.com>
</commit_message>
<xml_diff>
--- a/manuscript/Registry_Borrowing.docx
+++ b/manuscript/Registry_Borrowing.docx
@@ -12182,6 +12182,22 @@
       </w:r>
       <w:r>
         <w:t xml:space="preserve">The external point estimates are marginally more conservative (−0.019 to −0.021 vs −0.023) but all robustly negative with CI &lt; 0; per-family MAEs agree (COR/LOR/SMD ≈ 0.22/0.53/0.26 across engines). The confirmed win is the publishable claim of this work.</w:t>
+      </w:r>
+    </w:p>
+    <w:p>
+      <w:pPr>
+        <w:pStyle w:val="Heading2"/>
+      </w:pPr>
+      <w:r>
+        <w:t xml:space="preserve">6.1b Bounded real-registry demonstration — a learned-kernel win on ClinicalTrials.gov data with conformal repair</w:t>
+      </w:r>
+    </w:p>
+    <w:p>
+      <w:pPr>
+        <w:spacing w:after="120" w:line="276"/>
+      </w:pPr>
+      <w:r>
+        <w:t xml:space="preserve">Beyond the metadat corpus, the field was demonstrated on bounded real ClinicalTrials.gov data extracted truth-first from sponsors' own reported effect estimates + 2-sided 95% CIs (no arm re-derivation, pre-specified outcomes, one median effect per trial, CI round-trip verified): 37 meta-analyses / 412 trials across two log-effect families — log-odds (3 MAs/28) and a log-hazard-ratio oncology family (34 MAs/384 survival-HR trials). On the real oncology hazard-ratio field the learned kernel beats within-MA borrowing (−0.0109 [−0.0192, −0.0027], n = 384); appending the real MAs to the metadat corpus leaves the primary headline unchanged (corpus-only rows −0.0243 [−0.0361, −0.0126] — it survives expansion by a genuinely different data source), and the pooled held-out AACT rows are a marginal win (−0.0084 [−0.0168, −0.0001]); the 28-node log-odds slice is an underpowered tie. Crucially, split-conformal calibration that includes AACT-regime residuals repairs the raw Gaussian-process interval coverage on the real AACT rows from 0.672 to 0.903 (nominal 0.90). This is a bounded, verified demonstration — not a whole-registry run — that the learned-kernel field and its conformal layer carry to real registry data (aact_expand.py / aact_run.py; REPORT_BORROWING_FIELD.md §8bis.7).</w:t>
       </w:r>
     </w:p>
     <w:p>

</xml_diff>